<commit_message>
Add/update guj data for UWTranslationNotes
</commit_message>
<xml_diff>
--- a/guj/docx/49.content.docx
+++ b/guj/docx/49.content.docx
@@ -31448,6 +31448,81 @@
           <w:lang w:val="gu_IN" w:bidi="gu_IN"/>
         </w:rPr>
         <w:t>રૂપક</w:t>
+      </w:r>
+      <w:r>
+        <w:rPr>
+          <w:lang w:val="gu_IN" w:bidi="gu_IN"/>
+        </w:rPr>
+        <w:t>)</w:t>
+      </w:r>
+      <w:r>
+        <w:rPr>
+          <w:lang w:val="gu_IN" w:bidi="gu_IN"/>
+        </w:rPr>
+      </w:r>
+      <w:r>
+        <w:rPr>
+          <w:lang w:val="gu_IN" w:bidi="gu_IN"/>
+        </w:rPr>
+      </w:r>
+    </w:p>
+    <w:p>
+      <w:pPr/>
+      <w:r>
+        <w:rPr>
+          <w:lang w:val="gu_IN" w:bidi="gu_IN"/>
+        </w:rPr>
+      </w:r>
+    </w:p>
+    <w:p>
+      <w:pPr>
+        <w:pStyle w:val="Heading2"/>
+      </w:pPr>
+      <w:r>
+        <w:rPr>
+          <w:lang w:val="gu_IN" w:bidi="gu_IN"/>
+        </w:rPr>
+        <w:t>એફેસીઓને પત્ર 6:21 (#2)</w:t>
+      </w:r>
+      <w:r>
+        <w:rPr>
+          <w:lang w:val="gu_IN" w:bidi="gu_IN"/>
+        </w:rPr>
+      </w:r>
+    </w:p>
+    <w:p>
+      <w:pPr/>
+      <w:r>
+        <w:rPr>
+          <w:lang w:val="gu_IN" w:bidi="gu_IN"/>
+        </w:rPr>
+      </w:r>
+      <w:r>
+        <w:rPr>
+          <w:b/>
+          <w:lang w:val="gu_IN" w:bidi="gu_IN"/>
+        </w:rPr>
+        <w:t>"તુખિખસ"</w:t>
+      </w:r>
+    </w:p>
+    <w:p>
+      <w:pPr/>
+      <w:r>
+        <w:rPr>
+          <w:lang w:val="gu_IN" w:bidi="gu_IN"/>
+        </w:rPr>
+      </w:r>
+      <w:r>
+        <w:rPr>
+          <w:lang w:val="gu_IN" w:bidi="gu_IN"/>
+        </w:rPr>
+        <w:t xml:space="preserve">જે કેટલાક માણસોએ પાઉલ સાથે સેવા કરી તેમાંનો તુખિકસ એક હતો. (જુઓ : </w:t>
+      </w:r>
+      <w:r>
+        <w:rPr>
+          <w:lang w:val="gu_IN" w:bidi="gu_IN"/>
+        </w:rPr>
+        <w:t>નામોનો અનુવાદ કેવી રીતે કરવો</w:t>
       </w:r>
       <w:r>
         <w:rPr>

</xml_diff>